<commit_message>
Add explicit figure and table numbers to captions for Molecular Informatics revision
</commit_message>
<xml_diff>
--- a/paper/molecular_informatics_submission.docx
+++ b/paper/molecular_informatics_submission.docx
@@ -4432,7 +4432,7 @@
         <w:pStyle w:val="TableCaption"/>
       </w:pPr>
       <w:r>
-        <w:t xml:space="preserve">Spearman correlations between median rankings by definition family.</w:t>
+        <w:t xml:space="preserve">Table 1. Spearman correlations between median rankings by definition family.</w:t>
       </w:r>
       <w:r>
         <w:t xml:space="preserve"> </w:t>
@@ -4480,7 +4480,7 @@
         <w:tblStyle w:val="Table"/>
         <w:tblW w:type="auto" w:w="0"/>
         <w:tblLook w:firstRow="1" w:lastRow="0" w:firstColumn="0" w:lastColumn="0" w:noHBand="0" w:noVBand="0" w:val="0020"/>
-        <w:tblCaption w:val="Spearman correlations between median rankings by definition family. Upper triangle: Davis (n=68). Lower triangle: Klaeger (n=222)."/>
+        <w:tblCaption w:val="Table 1. Spearman correlations between median rankings by definition family. Upper triangle: Davis (n=68). Lower triangle: Klaeger (n=222)."/>
       </w:tblPr>
       <w:tblGrid>
         <w:gridCol w:w="1584"/>
@@ -4937,7 +4937,7 @@
         <w:pStyle w:val="ImageCaption"/>
       </w:pPr>
       <w:r>
-        <w:t xml:space="preserve">Best predictor of rank instability within each definition family</w:t>
+        <w:t xml:space="preserve">Figure 1. Best predictor of rank instability within each definition family</w:t>
       </w:r>
       <w:r>
         <w:t xml:space="preserve"> </w:t>
@@ -5680,7 +5680,7 @@
         <w:pStyle w:val="TableCaption"/>
       </w:pPr>
       <w:r>
-        <w:t xml:space="preserve">Spearman correlations between binding profile features and</w:t>
+        <w:t xml:space="preserve">Table 2. Spearman correlations between binding profile features and</w:t>
       </w:r>
       <w:r>
         <w:t xml:space="preserve"> </w:t>
@@ -5780,7 +5780,7 @@
         <w:tblStyle w:val="Table"/>
         <w:tblW w:type="auto" w:w="0"/>
         <w:tblLook w:firstRow="1" w:lastRow="0" w:firstColumn="0" w:lastColumn="0" w:noHBand="0" w:noVBand="0" w:val="0020"/>
-        <w:tblCaption w:val="Spearman correlations between binding profile features and within-family rank instability on the Klaeger dataset (n=206 active drugs). Significance: * p&lt;0.05, ** p&lt;0.01, *** p&lt;0.001."/>
+        <w:tblCaption w:val="Table 2. Spearman correlations between binding profile features and within-family rank instability on the Klaeger dataset (n=206 active drugs). Significance: * p&lt;0.05, ** p&lt;0.01, *** p&lt;0.001."/>
       </w:tblPr>
       <w:tblGrid>
         <w:gridCol w:w="1584"/>
@@ -6831,7 +6831,7 @@
         <w:pStyle w:val="ImageCaption"/>
       </w:pPr>
       <w:r>
-        <w:t xml:space="preserve">Representative binding profiles illustrating the three instability types.</w:t>
+        <w:t xml:space="preserve">Figure 2. Representative binding profiles illustrating the three instability types.</w:t>
       </w:r>
       <w:r>
         <w:t xml:space="preserve"> </w:t>
@@ -8835,7 +8835,7 @@
         <w:pStyle w:val="ImageCaption"/>
       </w:pPr>
       <w:r>
-        <w:t xml:space="preserve">Mean Spearman correlation between rankings computed on random</w:t>
+        <w:t xml:space="preserve">Figure 3. Mean Spearman correlation between rankings computed on random</w:t>
       </w:r>
       <w:r>
         <w:t xml:space="preserve"> </w:t>
@@ -11032,7 +11032,7 @@
         <w:pStyle w:val="TableCaption"/>
       </w:pPr>
       <w:r>
-        <w:t xml:space="preserve">Satisfaction of desiderata by existing selectivity definitions.</w:t>
+        <w:t xml:space="preserve">Table 3. Satisfaction of desiderata by existing selectivity definitions.</w:t>
       </w:r>
       <w:r>
         <w:t xml:space="preserve"> </w:t>
@@ -11082,7 +11082,7 @@
         <w:tblStyle w:val="Table"/>
         <w:tblW w:type="auto" w:w="0"/>
         <w:tblLook w:firstRow="1" w:lastRow="0" w:firstColumn="0" w:lastColumn="0" w:noHBand="0" w:noVBand="0" w:val="0020"/>
-        <w:tblCaption w:val="Satisfaction of desiderata by existing selectivity definitions. \checkmark: satisfied by construction. \sim: partially satisfied or satisfied under additional assumptions. \times: violated in general."/>
+        <w:tblCaption w:val="Table 3. Satisfaction of desiderata by existing selectivity definitions. \checkmark: satisfied by construction. \sim: partially satisfied or satisfied under additional assumptions. \times: violated in general."/>
       </w:tblPr>
       <w:tblGrid>
         <w:gridCol w:w="1584"/>

</xml_diff>

<commit_message>
Add IOG affiliation to author block, fix author info in Word submission
</commit_message>
<xml_diff>
--- a/paper/molecular_informatics_submission.docx
+++ b/paper/molecular_informatics_submission.docx
@@ -186,7 +186,7 @@
         <w:t xml:space="preserve">satisfy; no existing definition satisfies all four simultaneously.</w:t>
       </w:r>
     </w:p>
-    <w:bookmarkStart w:id="9" w:name="sec:intro"/>
+    <w:bookmarkStart w:id="10" w:name="introduction"/>
     <w:p>
       <w:pPr>
         <w:pStyle w:val="Heading1"/>
@@ -198,6 +198,63 @@
     <w:p>
       <w:pPr>
         <w:pStyle w:val="FirstParagraph"/>
+      </w:pPr>
+      <w:r>
+        <w:rPr>
+          <w:b/>
+          <w:bCs/>
+        </w:rPr>
+        <w:t xml:space="preserve">Author:</w:t>
+      </w:r>
+      <w:r>
+        <w:t xml:space="preserve"> </w:t>
+      </w:r>
+      <w:r>
+        <w:t xml:space="preserve">Polina Vinogradova, Input Output Global, Singapore.</w:t>
+      </w:r>
+      <w:r>
+        <w:t xml:space="preserve"> </w:t>
+      </w:r>
+      <w:r>
+        <w:rPr>
+          <w:b/>
+          <w:bCs/>
+        </w:rPr>
+        <w:t xml:space="preserve">Email:</w:t>
+      </w:r>
+      <w:r>
+        <w:t xml:space="preserve"> </w:t>
+      </w:r>
+      <w:r>
+        <w:t xml:space="preserve">polina.vino@gmail.com.</w:t>
+      </w:r>
+      <w:r>
+        <w:t xml:space="preserve"> </w:t>
+      </w:r>
+      <w:r>
+        <w:rPr>
+          <w:b/>
+          <w:bCs/>
+        </w:rPr>
+        <w:t xml:space="preserve">ORCID:</w:t>
+      </w:r>
+      <w:r>
+        <w:t xml:space="preserve"> </w:t>
+      </w:r>
+      <w:r>
+        <w:t xml:space="preserve">0000-0003-3271-3841.</w:t>
+      </w:r>
+    </w:p>
+    <w:p>
+      <w:pPr>
+        <w:pStyle w:val="BodyText"/>
+      </w:pPr>
+      <w:bookmarkStart w:id="9" w:name="sec:intro"/>
+      <w:bookmarkEnd w:id="9"/>
+    </w:p>
+    <w:p>
+      <w:pPr>
+        <w:pStyle w:val="BodyText"/>
       </w:pPr>
       <w:r>
         <w:t xml:space="preserve">Kinase inhibitors are among the most intensely investigated compound classes</w:t>
@@ -916,8 +973,8 @@
         <w:t xml:space="preserve">functions.</w:t>
       </w:r>
     </w:p>
-    <w:bookmarkEnd w:id="9"/>
-    <w:bookmarkStart w:id="12" w:name="sec:related"/>
+    <w:bookmarkEnd w:id="10"/>
+    <w:bookmarkStart w:id="13" w:name="sec:related"/>
     <w:p>
       <w:pPr>
         <w:pStyle w:val="Heading1"/>
@@ -926,7 +983,7 @@
         <w:t xml:space="preserve">Related Work</w:t>
       </w:r>
     </w:p>
-    <w:bookmarkStart w:id="10" w:name="sec:related:metrics"/>
+    <w:bookmarkStart w:id="11" w:name="sec:related:metrics"/>
     <w:p>
       <w:pPr>
         <w:pStyle w:val="Heading2"/>
@@ -1265,8 +1322,8 @@
         <w:t xml:space="preserve">The present work addresses both gaps.</w:t>
       </w:r>
     </w:p>
-    <w:bookmarkEnd w:id="10"/>
-    <w:bookmarkStart w:id="11" w:name="sec:related:axiomatic"/>
+    <w:bookmarkEnd w:id="11"/>
+    <w:bookmarkStart w:id="12" w:name="sec:related:axiomatic"/>
     <w:p>
       <w:pPr>
         <w:pStyle w:val="Heading2"/>
@@ -1617,9 +1674,9 @@
         <w:t xml:space="preserve">future formal axiomatization.</w:t>
       </w:r>
     </w:p>
-    <w:bookmarkEnd w:id="11"/>
     <w:bookmarkEnd w:id="12"/>
-    <w:bookmarkStart w:id="17" w:name="sec:methods"/>
+    <w:bookmarkEnd w:id="13"/>
+    <w:bookmarkStart w:id="18" w:name="sec:methods"/>
     <w:p>
       <w:pPr>
         <w:pStyle w:val="Heading1"/>
@@ -1628,7 +1685,7 @@
         <w:t xml:space="preserve">Methods</w:t>
       </w:r>
     </w:p>
-    <w:bookmarkStart w:id="13" w:name="sec:methods:data"/>
+    <w:bookmarkStart w:id="14" w:name="sec:methods:data"/>
     <w:p>
       <w:pPr>
         <w:pStyle w:val="Heading2"/>
@@ -2300,8 +2357,8 @@
         <w:t xml:space="preserve">reflecting the more stringent detection threshold of the chemoproteomic assay.</w:t>
       </w:r>
     </w:p>
-    <w:bookmarkEnd w:id="13"/>
-    <w:bookmarkStart w:id="14" w:name="sec:methods:defs"/>
+    <w:bookmarkEnd w:id="14"/>
+    <w:bookmarkStart w:id="15" w:name="sec:methods:defs"/>
     <w:p>
       <w:pPr>
         <w:pStyle w:val="Heading2"/>
@@ -3783,8 +3840,8 @@
         <w:t xml:space="preserve">Higher values indicate greater selectivity.</w:t>
       </w:r>
     </w:p>
-    <w:bookmarkEnd w:id="14"/>
-    <w:bookmarkStart w:id="15" w:name="sec:methods:stability"/>
+    <w:bookmarkEnd w:id="15"/>
+    <w:bookmarkStart w:id="16" w:name="sec:methods:stability"/>
     <w:p>
       <w:pPr>
         <w:pStyle w:val="Heading2"/>
@@ -4086,8 +4143,8 @@
         <w:t xml:space="preserve">[21–23]</w:t>
       </w:r>
     </w:p>
-    <w:bookmarkEnd w:id="15"/>
-    <w:bookmarkStart w:id="16" w:name="sec:methods:outcomes"/>
+    <w:bookmarkEnd w:id="16"/>
+    <w:bookmarkStart w:id="17" w:name="sec:methods:outcomes"/>
     <w:p>
       <w:pPr>
         <w:pStyle w:val="Heading2"/>
@@ -4212,9 +4269,9 @@
         <w:t xml:space="preserve">assessed using Spearman correlation across drugs with available data.</w:t>
       </w:r>
     </w:p>
-    <w:bookmarkEnd w:id="16"/>
     <w:bookmarkEnd w:id="17"/>
-    <w:bookmarkStart w:id="39" w:name="sec:results"/>
+    <w:bookmarkEnd w:id="18"/>
+    <w:bookmarkStart w:id="40" w:name="sec:results"/>
     <w:p>
       <w:pPr>
         <w:pStyle w:val="Heading1"/>
@@ -4223,7 +4280,7 @@
         <w:t xml:space="preserve">Results</w:t>
       </w:r>
     </w:p>
-    <w:bookmarkStart w:id="19" w:name="sec:results:families"/>
+    <w:bookmarkStart w:id="20" w:name="sec:results:families"/>
     <w:p>
       <w:pPr>
         <w:pStyle w:val="Heading2"/>
@@ -4426,7 +4483,7 @@
         <w:t xml:space="preserve">.</w:t>
       </w:r>
     </w:p>
-    <w:bookmarkStart w:id="18" w:name="tab:correlations"/>
+    <w:bookmarkStart w:id="19" w:name="tab:correlations"/>
     <w:p>
       <w:pPr>
         <w:pStyle w:val="TableCaption"/>
@@ -4799,7 +4856,7 @@
         </w:tc>
       </w:tr>
     </w:tbl>
-    <w:bookmarkEnd w:id="18"/>
+    <w:bookmarkEnd w:id="19"/>
     <w:p>
       <w:pPr>
         <w:pStyle w:val="BodyText"/>
@@ -4874,8 +4931,8 @@
         <w:t xml:space="preserve">(activity distributed across many targets).</w:t>
       </w:r>
     </w:p>
-    <w:bookmarkEnd w:id="19"/>
-    <w:bookmarkStart w:id="26" w:name="X407cca15bdde686e5bbf06b870ccd8ee8d81a52"/>
+    <w:bookmarkEnd w:id="20"/>
+    <w:bookmarkStart w:id="27" w:name="X407cca15bdde686e5bbf06b870ccd8ee8d81a52"/>
     <w:p>
       <w:pPr>
         <w:pStyle w:val="Heading2"/>
@@ -4884,7 +4941,7 @@
         <w:t xml:space="preserve">Rank Instability Is Structured and Predictable</w:t>
       </w:r>
     </w:p>
-    <w:bookmarkStart w:id="23" w:name="fig:instability"/>
+    <w:bookmarkStart w:id="24" w:name="fig:instability"/>
     <w:p>
       <w:pPr>
         <w:pStyle w:val="CaptionedFigure"/>
@@ -4894,18 +4951,18 @@
           <wp:inline>
             <wp:extent cx="4533900" cy="1130624"/>
             <wp:effectExtent b="0" l="0" r="0" t="0"/>
-            <wp:docPr descr="" title="" id="21" name="Picture"/>
+            <wp:docPr descr="" title="" id="22" name="Picture"/>
             <a:graphic>
               <a:graphicData uri="http://schemas.openxmlformats.org/drawingml/2006/picture">
                 <pic:pic>
                   <pic:nvPicPr>
-                    <pic:cNvPr descr="figures/instability_by_family.png" id="22" name="Picture"/>
+                    <pic:cNvPr descr="figures/instability_by_family.png" id="23" name="Picture"/>
                     <pic:cNvPicPr>
                       <a:picLocks noChangeArrowheads="1" noChangeAspect="1"/>
                     </pic:cNvPicPr>
                   </pic:nvPicPr>
                   <pic:blipFill>
-                    <a:blip r:embed="rId20"/>
+                    <a:blip r:embed="rId21"/>
                     <a:stretch>
                       <a:fillRect/>
                     </a:stretch>
@@ -5021,13 +5078,13 @@
         <w:t xml:space="preserve">of the active affinity distribution.</w:t>
       </w:r>
     </w:p>
-    <w:bookmarkEnd w:id="23"/>
+    <w:bookmarkEnd w:id="24"/>
     <w:p>
       <w:pPr>
         <w:pStyle w:val="BodyText"/>
       </w:pPr>
-      <w:bookmarkStart w:id="24" w:name="sec:results:instability"/>
-      <w:bookmarkEnd w:id="24"/>
+      <w:bookmarkStart w:id="25" w:name="sec:results:instability"/>
+      <w:bookmarkEnd w:id="25"/>
     </w:p>
     <w:p>
       <w:pPr>
@@ -5674,7 +5731,7 @@
         <w:t xml:space="preserve">relative to the threshold rather than by intrinsic profile shape.</w:t>
       </w:r>
     </w:p>
-    <w:bookmarkStart w:id="25" w:name="tab:predictors"/>
+    <w:bookmarkStart w:id="26" w:name="tab:predictors"/>
     <w:p>
       <w:pPr>
         <w:pStyle w:val="TableCaption"/>
@@ -6767,9 +6824,9 @@
         </w:tc>
       </w:tr>
     </w:tbl>
-    <w:bookmarkEnd w:id="25"/>
     <w:bookmarkEnd w:id="26"/>
-    <w:bookmarkStart w:id="32" w:name="X68735c2df90b804286b45acb5adfd4c5f45277c"/>
+    <w:bookmarkEnd w:id="27"/>
+    <w:bookmarkStart w:id="33" w:name="X68735c2df90b804286b45acb5adfd4c5f45277c"/>
     <w:p>
       <w:pPr>
         <w:pStyle w:val="Heading2"/>
@@ -6778,7 +6835,7 @@
         <w:t xml:space="preserve">Three Mechanistically Distinct Sources of Instability</w:t>
       </w:r>
     </w:p>
-    <w:bookmarkStart w:id="30" w:name="fig:profiles"/>
+    <w:bookmarkStart w:id="31" w:name="fig:profiles"/>
     <w:p>
       <w:pPr>
         <w:pStyle w:val="CaptionedFigure"/>
@@ -6788,18 +6845,18 @@
           <wp:inline>
             <wp:extent cx="4533900" cy="1179138"/>
             <wp:effectExtent b="0" l="0" r="0" t="0"/>
-            <wp:docPr descr="" title="" id="28" name="Picture"/>
+            <wp:docPr descr="" title="" id="29" name="Picture"/>
             <a:graphic>
               <a:graphicData uri="http://schemas.openxmlformats.org/drawingml/2006/picture">
                 <pic:pic>
                   <pic:nvPicPr>
-                    <pic:cNvPr descr="figures/binding_profiles.png" id="29" name="Picture"/>
+                    <pic:cNvPr descr="figures/binding_profiles.png" id="30" name="Picture"/>
                     <pic:cNvPicPr>
                       <a:picLocks noChangeArrowheads="1" noChangeAspect="1"/>
                     </pic:cNvPicPr>
                   </pic:nvPicPr>
                   <pic:blipFill>
-                    <a:blip r:embed="rId27"/>
+                    <a:blip r:embed="rId28"/>
                     <a:stretch>
                       <a:fillRect/>
                     </a:stretch>
@@ -7024,13 +7081,13 @@
         <w:t xml:space="preserve">assay floor.</w:t>
       </w:r>
     </w:p>
-    <w:bookmarkEnd w:id="30"/>
+    <w:bookmarkEnd w:id="31"/>
     <w:p>
       <w:pPr>
         <w:pStyle w:val="BodyText"/>
       </w:pPr>
-      <w:bookmarkStart w:id="31" w:name="sec:results:taxonomy"/>
-      <w:bookmarkEnd w:id="31"/>
+      <w:bookmarkStart w:id="32" w:name="sec:results:taxonomy"/>
+      <w:bookmarkEnd w:id="32"/>
     </w:p>
     <w:p>
       <w:pPr>
@@ -7995,8 +8052,8 @@
         <w:t xml:space="preserve">despite — or rather because of — high promiscuity.</w:t>
       </w:r>
     </w:p>
-    <w:bookmarkEnd w:id="32"/>
-    <w:bookmarkStart w:id="33" w:name="sec:results:outcomes"/>
+    <w:bookmarkEnd w:id="33"/>
+    <w:bookmarkStart w:id="34" w:name="sec:results:outcomes"/>
     <w:p>
       <w:pPr>
         <w:pStyle w:val="Heading2"/>
@@ -8277,8 +8334,8 @@
         <w:t xml:space="preserve">studied here.</w:t>
       </w:r>
     </w:p>
-    <w:bookmarkEnd w:id="33"/>
-    <w:bookmarkStart w:id="38" w:name="sec:results:panelsize"/>
+    <w:bookmarkEnd w:id="34"/>
+    <w:bookmarkStart w:id="39" w:name="sec:results:panelsize"/>
     <w:p>
       <w:pPr>
         <w:pStyle w:val="Heading2"/>
@@ -8782,7 +8839,7 @@
         <w:t xml:space="preserve">and reinforces D2 (bounded gap sensitivity) as a necessary desideratum.</w:t>
       </w:r>
     </w:p>
-    <w:bookmarkStart w:id="37" w:name="fig:panelsize"/>
+    <w:bookmarkStart w:id="38" w:name="fig:panelsize"/>
     <w:p>
       <w:pPr>
         <w:pStyle w:val="CaptionedFigure"/>
@@ -8792,18 +8849,18 @@
           <wp:inline>
             <wp:extent cx="4000500" cy="2469903"/>
             <wp:effectExtent b="0" l="0" r="0" t="0"/>
-            <wp:docPr descr="" title="" id="35" name="Picture"/>
+            <wp:docPr descr="" title="" id="36" name="Picture"/>
             <a:graphic>
               <a:graphicData uri="http://schemas.openxmlformats.org/drawingml/2006/picture">
                 <pic:pic>
                   <pic:nvPicPr>
-                    <pic:cNvPr descr="figures/panel_size_stability.png" id="36" name="Picture"/>
+                    <pic:cNvPr descr="figures/panel_size_stability.png" id="37" name="Picture"/>
                     <pic:cNvPicPr>
                       <a:picLocks noChangeArrowheads="1" noChangeAspect="1"/>
                     </pic:cNvPicPr>
                   </pic:nvPicPr>
                   <pic:blipFill>
-                    <a:blip r:embed="rId34"/>
+                    <a:blip r:embed="rId35"/>
                     <a:stretch>
                       <a:fillRect/>
                     </a:stretch>
@@ -8949,10 +9006,10 @@
         <w:t xml:space="preserve">at any practically used panel size.</w:t>
       </w:r>
     </w:p>
-    <w:bookmarkEnd w:id="37"/>
     <w:bookmarkEnd w:id="38"/>
     <w:bookmarkEnd w:id="39"/>
-    <w:bookmarkStart w:id="45" w:name="sec:desiderata"/>
+    <w:bookmarkEnd w:id="40"/>
+    <w:bookmarkStart w:id="46" w:name="sec:desiderata"/>
     <w:p>
       <w:pPr>
         <w:pStyle w:val="Heading1"/>
@@ -9260,7 +9317,7 @@
         <w:t xml:space="preserve">-scores.</w:t>
       </w:r>
     </w:p>
-    <w:bookmarkStart w:id="40" w:name="d1-reliability-threshold."/>
+    <w:bookmarkStart w:id="41" w:name="d1-reliability-threshold."/>
     <w:p>
       <w:pPr>
         <w:pStyle w:val="Heading4"/>
@@ -9512,8 +9569,8 @@
         <w:t xml:space="preserve">sub-micromolar binding, treating detection floor values as informative.</w:t>
       </w:r>
     </w:p>
-    <w:bookmarkEnd w:id="40"/>
-    <w:bookmarkStart w:id="41" w:name="d2-bounded-gap-sensitivity."/>
+    <w:bookmarkEnd w:id="41"/>
+    <w:bookmarkStart w:id="42" w:name="d2-bounded-gap-sensitivity."/>
     <w:p>
       <w:pPr>
         <w:pStyle w:val="Heading4"/>
@@ -10068,8 +10125,8 @@
         <w:t xml:space="preserve">this property because they do not privilege any single pairwise comparison.</w:t>
       </w:r>
     </w:p>
-    <w:bookmarkEnd w:id="41"/>
-    <w:bookmarkStart w:id="42" w:name="d3-distributional-consistency."/>
+    <w:bookmarkEnd w:id="42"/>
+    <w:bookmarkStart w:id="43" w:name="d3-distributional-consistency."/>
     <w:p>
       <w:pPr>
         <w:pStyle w:val="Heading4"/>
@@ -10601,8 +10658,8 @@
         <w:t xml:space="preserve">reasonable neighborhood, which existing implementations do not guarantee.</w:t>
       </w:r>
     </w:p>
-    <w:bookmarkEnd w:id="42"/>
-    <w:bookmarkStart w:id="44" w:name="Xfa395bfc7f57b26bc6db33f24618a71aa662a1d"/>
+    <w:bookmarkEnd w:id="43"/>
+    <w:bookmarkStart w:id="45" w:name="Xfa395bfc7f57b26bc6db33f24618a71aa662a1d"/>
     <w:p>
       <w:pPr>
         <w:pStyle w:val="Heading4"/>
@@ -11026,7 +11083,7 @@
         <w:t xml:space="preserve">targets of a formal axiomatization.</w:t>
       </w:r>
     </w:p>
-    <w:bookmarkStart w:id="43" w:name="tab:desiderata"/>
+    <w:bookmarkStart w:id="44" w:name="tab:desiderata"/>
     <w:p>
       <w:pPr>
         <w:pStyle w:val="TableCaption"/>
@@ -11485,10 +11542,10 @@
         </w:tc>
       </w:tr>
     </w:tbl>
-    <w:bookmarkEnd w:id="43"/>
     <w:bookmarkEnd w:id="44"/>
     <w:bookmarkEnd w:id="45"/>
-    <w:bookmarkStart w:id="51" w:name="sec:discussion"/>
+    <w:bookmarkEnd w:id="46"/>
+    <w:bookmarkStart w:id="52" w:name="sec:discussion"/>
     <w:p>
       <w:pPr>
         <w:pStyle w:val="Heading1"/>
@@ -11596,7 +11653,7 @@
         <w:t xml:space="preserve">materially affects the outcome.</w:t>
       </w:r>
     </w:p>
-    <w:bookmarkStart w:id="46" w:name="X5b87559a6c76d4faeea8d0d24aa5e07da6a4ac8"/>
+    <w:bookmarkStart w:id="47" w:name="X5b87559a6c76d4faeea8d0d24aa5e07da6a4ac8"/>
     <w:p>
       <w:pPr>
         <w:pStyle w:val="Heading2"/>
@@ -11717,8 +11774,8 @@
         <w:t xml:space="preserve">this question precise enough that it can be answered formally.</w:t>
       </w:r>
     </w:p>
-    <w:bookmarkEnd w:id="46"/>
-    <w:bookmarkStart w:id="47" w:name="X072d385851efccb7b10eae7a092318f59024522"/>
+    <w:bookmarkEnd w:id="47"/>
+    <w:bookmarkStart w:id="48" w:name="X072d385851efccb7b10eae7a092318f59024522"/>
     <w:p>
       <w:pPr>
         <w:pStyle w:val="Heading2"/>
@@ -11911,8 +11968,8 @@
         <w:t xml:space="preserve">trivially because they do not use a distributional baseline at all.</w:t>
       </w:r>
     </w:p>
-    <w:bookmarkEnd w:id="47"/>
-    <w:bookmarkStart w:id="48" w:name="practical-recommendations"/>
+    <w:bookmarkEnd w:id="48"/>
+    <w:bookmarkStart w:id="49" w:name="practical-recommendations"/>
     <w:p>
       <w:pPr>
         <w:pStyle w:val="Heading2"/>
@@ -12078,8 +12135,8 @@
         <w:t xml:space="preserve">distribution-based measures without acknowledging the conceptual distinction.</w:t>
       </w:r>
     </w:p>
-    <w:bookmarkEnd w:id="48"/>
-    <w:bookmarkStart w:id="49" w:name="limitations"/>
+    <w:bookmarkEnd w:id="49"/>
+    <w:bookmarkStart w:id="50" w:name="limitations"/>
     <w:p>
       <w:pPr>
         <w:pStyle w:val="Heading2"/>
@@ -12276,8 +12333,8 @@
         <w:t xml:space="preserve">desideratum–definition pair is left for future work.</w:t>
       </w:r>
     </w:p>
-    <w:bookmarkEnd w:id="49"/>
-    <w:bookmarkStart w:id="50" w:name="relation-to-formal-methods"/>
+    <w:bookmarkEnd w:id="50"/>
+    <w:bookmarkStart w:id="51" w:name="relation-to-formal-methods"/>
     <w:p>
       <w:pPr>
         <w:pStyle w:val="Heading2"/>
@@ -12416,9 +12473,9 @@
         <w:t xml:space="preserve">[18]</w:t>
       </w:r>
     </w:p>
-    <w:bookmarkEnd w:id="50"/>
     <w:bookmarkEnd w:id="51"/>
-    <w:bookmarkStart w:id="52" w:name="sec:conclusion"/>
+    <w:bookmarkEnd w:id="52"/>
+    <w:bookmarkStart w:id="53" w:name="sec:conclusion"/>
     <w:p>
       <w:pPr>
         <w:pStyle w:val="Heading1"/>
@@ -12551,8 +12608,8 @@
         <w:t xml:space="preserve">formal program.</w:t>
       </w:r>
     </w:p>
-    <w:bookmarkEnd w:id="52"/>
-    <w:bookmarkStart w:id="53" w:name="acknowledgements"/>
+    <w:bookmarkEnd w:id="53"/>
+    <w:bookmarkStart w:id="54" w:name="acknowledgements"/>
     <w:p>
       <w:pPr>
         <w:pStyle w:val="Heading1"/>
@@ -12647,8 +12704,8 @@
         <w:t xml:space="preserve">to Anthropic or any third party.</w:t>
       </w:r>
     </w:p>
-    <w:bookmarkEnd w:id="53"/>
-    <w:bookmarkStart w:id="55" w:name="supporting-information"/>
+    <w:bookmarkEnd w:id="54"/>
+    <w:bookmarkStart w:id="56" w:name="supporting-information"/>
     <w:p>
       <w:pPr>
         <w:pStyle w:val="Heading1"/>
@@ -12667,7 +12724,7 @@
       <w:r>
         <w:t xml:space="preserve"> </w:t>
       </w:r>
-      <w:hyperlink r:id="rId54">
+      <w:hyperlink r:id="rId55">
         <w:r>
           <w:rPr>
             <w:rStyle w:val="Hyperlink"/>
@@ -12679,8 +12736,8 @@
         <w:t xml:space="preserve">.</w:t>
       </w:r>
     </w:p>
-    <w:bookmarkEnd w:id="55"/>
-    <w:bookmarkStart w:id="105" w:name="data-and-software-availability"/>
+    <w:bookmarkEnd w:id="56"/>
+    <w:bookmarkStart w:id="106" w:name="data-and-software-availability"/>
     <w:p>
       <w:pPr>
         <w:pStyle w:val="Heading1"/>
@@ -12705,7 +12762,7 @@
       <w:r>
         <w:t xml:space="preserve"> </w:t>
       </w:r>
-      <w:hyperlink r:id="rId56">
+      <w:hyperlink r:id="rId57">
         <w:r>
           <w:rPr>
             <w:rStyle w:val="Hyperlink"/>
@@ -12731,7 +12788,7 @@
       <w:r>
         <w:t xml:space="preserve"> </w:t>
       </w:r>
-      <w:hyperlink r:id="rId57">
+      <w:hyperlink r:id="rId58">
         <w:r>
           <w:rPr>
             <w:rStyle w:val="Hyperlink"/>
@@ -12757,7 +12814,7 @@
       <w:r>
         <w:t xml:space="preserve"> </w:t>
       </w:r>
-      <w:hyperlink r:id="rId58">
+      <w:hyperlink r:id="rId59">
         <w:r>
           <w:rPr>
             <w:rStyle w:val="Hyperlink"/>
@@ -12787,8 +12844,8 @@
         <w:t xml:space="preserve">publicly available data and code.</w:t>
       </w:r>
     </w:p>
-    <w:bookmarkStart w:id="104" w:name="refs"/>
-    <w:bookmarkStart w:id="60" w:name="ref-Roskoski2024"/>
+    <w:bookmarkStart w:id="105" w:name="refs"/>
+    <w:bookmarkStart w:id="61" w:name="ref-Roskoski2024"/>
     <w:p>
       <w:pPr>
         <w:pStyle w:val="Bibliography"/>
@@ -12808,7 +12865,7 @@
       <w:r>
         <w:t xml:space="preserve"> </w:t>
       </w:r>
-      <w:hyperlink r:id="rId59">
+      <w:hyperlink r:id="rId60">
         <w:r>
           <w:rPr>
             <w:rStyle w:val="Hyperlink"/>
@@ -12854,8 +12911,8 @@
         <w:t xml:space="preserve">200:107059.</w:t>
       </w:r>
     </w:p>
-    <w:bookmarkEnd w:id="60"/>
-    <w:bookmarkStart w:id="62" w:name="ref-Manning2002"/>
+    <w:bookmarkEnd w:id="61"/>
+    <w:bookmarkStart w:id="63" w:name="ref-Manning2002"/>
     <w:p>
       <w:pPr>
         <w:pStyle w:val="Bibliography"/>
@@ -12875,7 +12932,7 @@
       <w:r>
         <w:t xml:space="preserve"> </w:t>
       </w:r>
-      <w:hyperlink r:id="rId61">
+      <w:hyperlink r:id="rId62">
         <w:r>
           <w:rPr>
             <w:rStyle w:val="Hyperlink"/>
@@ -12903,8 +12960,8 @@
         <w:t xml:space="preserve">298:1912–1934.</w:t>
       </w:r>
     </w:p>
-    <w:bookmarkEnd w:id="62"/>
-    <w:bookmarkStart w:id="64" w:name="ref-Bhullar2018"/>
+    <w:bookmarkEnd w:id="63"/>
+    <w:bookmarkStart w:id="65" w:name="ref-Bhullar2018"/>
     <w:p>
       <w:pPr>
         <w:pStyle w:val="Bibliography"/>
@@ -12924,7 +12981,7 @@
       <w:r>
         <w:t xml:space="preserve"> </w:t>
       </w:r>
-      <w:hyperlink r:id="rId63">
+      <w:hyperlink r:id="rId64">
         <w:r>
           <w:rPr>
             <w:rStyle w:val="Hyperlink"/>
@@ -12952,8 +13009,8 @@
         <w:t xml:space="preserve">17:48.</w:t>
       </w:r>
     </w:p>
-    <w:bookmarkEnd w:id="64"/>
-    <w:bookmarkStart w:id="66" w:name="ref-Karaman2008"/>
+    <w:bookmarkEnd w:id="65"/>
+    <w:bookmarkStart w:id="67" w:name="ref-Karaman2008"/>
     <w:p>
       <w:pPr>
         <w:pStyle w:val="Bibliography"/>
@@ -12973,7 +13030,7 @@
       <w:r>
         <w:t xml:space="preserve"> </w:t>
       </w:r>
-      <w:hyperlink r:id="rId65">
+      <w:hyperlink r:id="rId66">
         <w:r>
           <w:rPr>
             <w:rStyle w:val="Hyperlink"/>
@@ -13001,8 +13058,8 @@
         <w:t xml:space="preserve">26:127–132.</w:t>
       </w:r>
     </w:p>
-    <w:bookmarkEnd w:id="66"/>
-    <w:bookmarkStart w:id="68" w:name="ref-Uitdehaag2011"/>
+    <w:bookmarkEnd w:id="67"/>
+    <w:bookmarkStart w:id="69" w:name="ref-Uitdehaag2011"/>
     <w:p>
       <w:pPr>
         <w:pStyle w:val="Bibliography"/>
@@ -13022,7 +13079,7 @@
       <w:r>
         <w:t xml:space="preserve"> </w:t>
       </w:r>
-      <w:hyperlink r:id="rId67">
+      <w:hyperlink r:id="rId68">
         <w:r>
           <w:rPr>
             <w:rStyle w:val="Hyperlink"/>
@@ -13050,8 +13107,8 @@
         <w:t xml:space="preserve">12:94.</w:t>
       </w:r>
     </w:p>
-    <w:bookmarkEnd w:id="68"/>
-    <w:bookmarkStart w:id="70" w:name="ref-Graczyk2010"/>
+    <w:bookmarkEnd w:id="69"/>
+    <w:bookmarkStart w:id="71" w:name="ref-Graczyk2010"/>
     <w:p>
       <w:pPr>
         <w:pStyle w:val="Bibliography"/>
@@ -13071,7 +13128,7 @@
       <w:r>
         <w:t xml:space="preserve"> </w:t>
       </w:r>
-      <w:hyperlink r:id="rId69">
+      <w:hyperlink r:id="rId70">
         <w:r>
           <w:rPr>
             <w:rStyle w:val="Hyperlink"/>
@@ -13099,8 +13156,8 @@
         <w:t xml:space="preserve">50:5773–5779.</w:t>
       </w:r>
     </w:p>
-    <w:bookmarkEnd w:id="70"/>
-    <w:bookmarkStart w:id="71" w:name="ref-Klaeger2017"/>
+    <w:bookmarkEnd w:id="71"/>
+    <w:bookmarkStart w:id="72" w:name="ref-Klaeger2017"/>
     <w:p>
       <w:pPr>
         <w:pStyle w:val="Bibliography"/>
@@ -13120,7 +13177,7 @@
       <w:r>
         <w:t xml:space="preserve"> </w:t>
       </w:r>
-      <w:hyperlink r:id="rId57">
+      <w:hyperlink r:id="rId58">
         <w:r>
           <w:rPr>
             <w:rStyle w:val="Hyperlink"/>
@@ -13148,8 +13205,8 @@
         <w:t xml:space="preserve">358:eaan4368.</w:t>
       </w:r>
     </w:p>
-    <w:bookmarkEnd w:id="71"/>
-    <w:bookmarkStart w:id="73" w:name="ref-Bosc2017"/>
+    <w:bookmarkEnd w:id="72"/>
+    <w:bookmarkStart w:id="74" w:name="ref-Bosc2017"/>
     <w:p>
       <w:pPr>
         <w:pStyle w:val="Bibliography"/>
@@ -13169,7 +13226,7 @@
       <w:r>
         <w:t xml:space="preserve"> </w:t>
       </w:r>
-      <w:hyperlink r:id="rId72">
+      <w:hyperlink r:id="rId73">
         <w:r>
           <w:rPr>
             <w:rStyle w:val="Hyperlink"/>
@@ -13197,8 +13254,8 @@
         <w:t xml:space="preserve">18:17.</w:t>
       </w:r>
     </w:p>
-    <w:bookmarkEnd w:id="73"/>
-    <w:bookmarkStart w:id="75" w:name="ref-KInhibition2018"/>
+    <w:bookmarkEnd w:id="74"/>
+    <w:bookmarkStart w:id="76" w:name="ref-KInhibition2018"/>
     <w:p>
       <w:pPr>
         <w:pStyle w:val="Bibliography"/>
@@ -13218,7 +13275,7 @@
       <w:r>
         <w:t xml:space="preserve"> </w:t>
       </w:r>
-      <w:hyperlink r:id="rId74">
+      <w:hyperlink r:id="rId75">
         <w:r>
           <w:rPr>
             <w:rStyle w:val="Hyperlink"/>
@@ -13252,8 +13309,8 @@
         <w:t xml:space="preserve">8:29–37.</w:t>
       </w:r>
     </w:p>
-    <w:bookmarkEnd w:id="75"/>
-    <w:bookmarkStart w:id="77" w:name="ref-Shannon1948"/>
+    <w:bookmarkEnd w:id="76"/>
+    <w:bookmarkStart w:id="78" w:name="ref-Shannon1948"/>
     <w:p>
       <w:pPr>
         <w:pStyle w:val="Bibliography"/>
@@ -13273,7 +13330,7 @@
       <w:r>
         <w:t xml:space="preserve"> </w:t>
       </w:r>
-      <w:hyperlink r:id="rId76">
+      <w:hyperlink r:id="rId77">
         <w:r>
           <w:rPr>
             <w:rStyle w:val="Hyperlink"/>
@@ -13301,8 +13358,8 @@
         <w:t xml:space="preserve">27:379–423.</w:t>
       </w:r>
     </w:p>
-    <w:bookmarkEnd w:id="77"/>
-    <w:bookmarkStart w:id="78" w:name="ref-Arrow1951"/>
+    <w:bookmarkEnd w:id="78"/>
+    <w:bookmarkStart w:id="79" w:name="ref-Arrow1951"/>
     <w:p>
       <w:pPr>
         <w:pStyle w:val="Bibliography"/>
@@ -13320,8 +13377,8 @@
         <w:t xml:space="preserve">Arrow KJ Social choice and individual values. Wiley, New York,.</w:t>
       </w:r>
     </w:p>
-    <w:bookmarkEnd w:id="78"/>
-    <w:bookmarkStart w:id="80" w:name="ref-Bajorath2018"/>
+    <w:bookmarkEnd w:id="79"/>
+    <w:bookmarkStart w:id="81" w:name="ref-Bajorath2018"/>
     <w:p>
       <w:pPr>
         <w:pStyle w:val="Bibliography"/>
@@ -13341,7 +13398,7 @@
       <w:r>
         <w:t xml:space="preserve"> </w:t>
       </w:r>
-      <w:hyperlink r:id="rId79">
+      <w:hyperlink r:id="rId80">
         <w:r>
           <w:rPr>
             <w:rStyle w:val="Hyperlink"/>
@@ -13369,8 +13426,8 @@
         <w:t xml:space="preserve">3:17196–17206.</w:t>
       </w:r>
     </w:p>
-    <w:bookmarkEnd w:id="80"/>
-    <w:bookmarkStart w:id="81" w:name="ref-Khinchin1957"/>
+    <w:bookmarkEnd w:id="81"/>
+    <w:bookmarkStart w:id="82" w:name="ref-Khinchin1957"/>
     <w:p>
       <w:pPr>
         <w:pStyle w:val="Bibliography"/>
@@ -13388,8 +13445,8 @@
         <w:t xml:space="preserve">Khinchin AYa Mathematical foundations of information theory. Dover, New York,.</w:t>
       </w:r>
     </w:p>
-    <w:bookmarkEnd w:id="81"/>
-    <w:bookmarkStart w:id="83" w:name="ref-Pavillidis2022"/>
+    <w:bookmarkEnd w:id="82"/>
+    <w:bookmarkStart w:id="84" w:name="ref-Pavillidis2022"/>
     <w:p>
       <w:pPr>
         <w:pStyle w:val="Bibliography"/>
@@ -13409,7 +13466,7 @@
       <w:r>
         <w:t xml:space="preserve"> </w:t>
       </w:r>
-      <w:hyperlink r:id="rId82">
+      <w:hyperlink r:id="rId83">
         <w:r>
           <w:rPr>
             <w:rStyle w:val="Hyperlink"/>
@@ -13437,8 +13494,8 @@
         <w:t xml:space="preserve">36:43.</w:t>
       </w:r>
     </w:p>
-    <w:bookmarkEnd w:id="83"/>
-    <w:bookmarkStart w:id="85" w:name="ref-Cardelli2004"/>
+    <w:bookmarkEnd w:id="84"/>
+    <w:bookmarkStart w:id="86" w:name="ref-Cardelli2004"/>
     <w:p>
       <w:pPr>
         <w:pStyle w:val="Bibliography"/>
@@ -13458,7 +13515,7 @@
       <w:r>
         <w:t xml:space="preserve"> </w:t>
       </w:r>
-      <w:hyperlink r:id="rId84">
+      <w:hyperlink r:id="rId85">
         <w:r>
           <w:rPr>
             <w:rStyle w:val="Hyperlink"/>
@@ -13486,8 +13543,8 @@
         <w:t xml:space="preserve">3082:257–278.</w:t>
       </w:r>
     </w:p>
-    <w:bookmarkEnd w:id="85"/>
-    <w:bookmarkStart w:id="87" w:name="ref-Beaconcalculus2019"/>
+    <w:bookmarkEnd w:id="86"/>
+    <w:bookmarkStart w:id="88" w:name="ref-Beaconcalculus2019"/>
     <w:p>
       <w:pPr>
         <w:pStyle w:val="Bibliography"/>
@@ -13507,7 +13564,7 @@
       <w:r>
         <w:t xml:space="preserve"> </w:t>
       </w:r>
-      <w:hyperlink r:id="rId86">
+      <w:hyperlink r:id="rId87">
         <w:r>
           <w:rPr>
             <w:rStyle w:val="Hyperlink"/>
@@ -13535,8 +13592,8 @@
         <w:t xml:space="preserve">16:e1007646.</w:t>
       </w:r>
     </w:p>
-    <w:bookmarkEnd w:id="87"/>
-    <w:bookmarkStart w:id="89" w:name="ref-Kennedy1994"/>
+    <w:bookmarkEnd w:id="88"/>
+    <w:bookmarkStart w:id="90" w:name="ref-Kennedy1994"/>
     <w:p>
       <w:pPr>
         <w:pStyle w:val="Bibliography"/>
@@ -13556,7 +13613,7 @@
       <w:r>
         <w:t xml:space="preserve"> </w:t>
       </w:r>
-      <w:hyperlink r:id="rId88">
+      <w:hyperlink r:id="rId89">
         <w:r>
           <w:rPr>
             <w:rStyle w:val="Hyperlink"/>
@@ -13568,8 +13625,8 @@
         <w:t xml:space="preserve">. Springer,.</w:t>
       </w:r>
     </w:p>
-    <w:bookmarkEnd w:id="89"/>
-    <w:bookmarkStart w:id="91" w:name="ref-Lean4Mathlib"/>
+    <w:bookmarkEnd w:id="90"/>
+    <w:bookmarkStart w:id="92" w:name="ref-Lean4Mathlib"/>
     <w:p>
       <w:pPr>
         <w:pStyle w:val="Bibliography"/>
@@ -13589,7 +13646,7 @@
       <w:r>
         <w:t xml:space="preserve"> </w:t>
       </w:r>
-      <w:hyperlink r:id="rId90">
+      <w:hyperlink r:id="rId91">
         <w:r>
           <w:rPr>
             <w:rStyle w:val="Hyperlink"/>
@@ -13601,8 +13658,8 @@
         <w:t xml:space="preserve">.</w:t>
       </w:r>
     </w:p>
-    <w:bookmarkEnd w:id="91"/>
-    <w:bookmarkStart w:id="93" w:name="ref-Davis2011"/>
+    <w:bookmarkEnd w:id="92"/>
+    <w:bookmarkStart w:id="94" w:name="ref-Davis2011"/>
     <w:p>
       <w:pPr>
         <w:pStyle w:val="Bibliography"/>
@@ -13622,7 +13679,7 @@
       <w:r>
         <w:t xml:space="preserve"> </w:t>
       </w:r>
-      <w:hyperlink r:id="rId92">
+      <w:hyperlink r:id="rId93">
         <w:r>
           <w:rPr>
             <w:rStyle w:val="Hyperlink"/>
@@ -13650,8 +13707,8 @@
         <w:t xml:space="preserve">29:1046–1051.</w:t>
       </w:r>
     </w:p>
-    <w:bookmarkEnd w:id="93"/>
-    <w:bookmarkStart w:id="95" w:name="ref-DeepDTA"/>
+    <w:bookmarkEnd w:id="94"/>
+    <w:bookmarkStart w:id="96" w:name="ref-DeepDTA"/>
     <w:p>
       <w:pPr>
         <w:pStyle w:val="Bibliography"/>
@@ -13671,7 +13728,7 @@
       <w:r>
         <w:t xml:space="preserve"> </w:t>
       </w:r>
-      <w:hyperlink r:id="rId94">
+      <w:hyperlink r:id="rId95">
         <w:r>
           <w:rPr>
             <w:rStyle w:val="Hyperlink"/>
@@ -13705,8 +13762,8 @@
         <w:t xml:space="preserve">34:i821–i829.</w:t>
       </w:r>
     </w:p>
-    <w:bookmarkEnd w:id="95"/>
-    <w:bookmarkStart w:id="97" w:name="ref-NumPy"/>
+    <w:bookmarkEnd w:id="96"/>
+    <w:bookmarkStart w:id="98" w:name="ref-NumPy"/>
     <w:p>
       <w:pPr>
         <w:pStyle w:val="Bibliography"/>
@@ -13726,7 +13783,7 @@
       <w:r>
         <w:t xml:space="preserve"> </w:t>
       </w:r>
-      <w:hyperlink r:id="rId96">
+      <w:hyperlink r:id="rId97">
         <w:r>
           <w:rPr>
             <w:rStyle w:val="Hyperlink"/>
@@ -13766,8 +13823,8 @@
         <w:t xml:space="preserve">585:357–362.</w:t>
       </w:r>
     </w:p>
-    <w:bookmarkEnd w:id="97"/>
-    <w:bookmarkStart w:id="99" w:name="ref-pandas"/>
+    <w:bookmarkEnd w:id="98"/>
+    <w:bookmarkStart w:id="100" w:name="ref-pandas"/>
     <w:p>
       <w:pPr>
         <w:pStyle w:val="Bibliography"/>
@@ -13787,7 +13844,7 @@
       <w:r>
         <w:t xml:space="preserve"> </w:t>
       </w:r>
-      <w:hyperlink r:id="rId98">
+      <w:hyperlink r:id="rId99">
         <w:r>
           <w:rPr>
             <w:rStyle w:val="Hyperlink"/>
@@ -13811,8 +13868,8 @@
         <w:t xml:space="preserve">.</w:t>
       </w:r>
     </w:p>
-    <w:bookmarkEnd w:id="99"/>
-    <w:bookmarkStart w:id="101" w:name="ref-SciPy"/>
+    <w:bookmarkEnd w:id="100"/>
+    <w:bookmarkStart w:id="102" w:name="ref-SciPy"/>
     <w:p>
       <w:pPr>
         <w:pStyle w:val="Bibliography"/>
@@ -13832,7 +13889,7 @@
       <w:r>
         <w:t xml:space="preserve"> </w:t>
       </w:r>
-      <w:hyperlink r:id="rId100">
+      <w:hyperlink r:id="rId101">
         <w:r>
           <w:rPr>
             <w:rStyle w:val="Hyperlink"/>
@@ -13884,8 +13941,8 @@
         <w:t xml:space="preserve">17:261–272.</w:t>
       </w:r>
     </w:p>
-    <w:bookmarkEnd w:id="101"/>
-    <w:bookmarkStart w:id="103" w:name="ref-IUPAC2001"/>
+    <w:bookmarkEnd w:id="102"/>
+    <w:bookmarkStart w:id="104" w:name="ref-IUPAC2001"/>
     <w:p>
       <w:pPr>
         <w:pStyle w:val="Bibliography"/>
@@ -13905,7 +13962,7 @@
       <w:r>
         <w:t xml:space="preserve"> </w:t>
       </w:r>
-      <w:hyperlink r:id="rId102">
+      <w:hyperlink r:id="rId103">
         <w:r>
           <w:rPr>
             <w:rStyle w:val="Hyperlink"/>
@@ -13933,9 +13990,9 @@
         <w:t xml:space="preserve">73:1381–1386.</w:t>
       </w:r>
     </w:p>
-    <w:bookmarkEnd w:id="103"/>
     <w:bookmarkEnd w:id="104"/>
     <w:bookmarkEnd w:id="105"/>
+    <w:bookmarkEnd w:id="106"/>
     <w:sectPr>
       <w:footnotePr>
         <w:numRestart w:val="eachSect"/>

</xml_diff>

<commit_message>
Add in-text citations for Figure 1 and Figure 2
</commit_message>
<xml_diff>
--- a/paper/molecular_informatics_submission.docx
+++ b/paper/molecular_informatics_submission.docx
@@ -5268,6 +5268,23 @@
       </w:r>
       <w:r>
         <w:t xml:space="preserve">gap) is the strongest predictor of instability</w:t>
+      </w:r>
+      <w:r>
+        <w:t xml:space="preserve"> </w:t>
+      </w:r>
+      <w:r>
+        <w:t xml:space="preserve">(Figure </w:t>
+      </w:r>
+      <w:hyperlink w:anchor="fig:instability">
+        <w:r>
+          <w:rPr>
+            <w:rStyle w:val="Hyperlink"/>
+          </w:rPr>
+          <w:t xml:space="preserve">1</w:t>
+        </w:r>
+      </w:hyperlink>
+      <w:r>
+        <w:t xml:space="preserve">)</w:t>
       </w:r>
       <w:r>
         <w:t xml:space="preserve"> </w:t>
@@ -7100,7 +7117,24 @@
         <w:t xml:space="preserve"> </w:t>
       </w:r>
       <w:r>
-        <w:t xml:space="preserve">reveals three structurally distinct sources of rank instability, each</w:t>
+        <w:t xml:space="preserve">reveals three structurally distinct sources of rank instability</w:t>
+      </w:r>
+      <w:r>
+        <w:t xml:space="preserve"> </w:t>
+      </w:r>
+      <w:r>
+        <w:t xml:space="preserve">(Figure </w:t>
+      </w:r>
+      <w:hyperlink w:anchor="fig:profiles">
+        <w:r>
+          <w:rPr>
+            <w:rStyle w:val="Hyperlink"/>
+          </w:rPr>
+          <w:t xml:space="preserve">2</w:t>
+        </w:r>
+      </w:hyperlink>
+      <w:r>
+        <w:t xml:space="preserve">), each</w:t>
       </w:r>
       <w:r>
         <w:t xml:space="preserve"> </w:t>

</xml_diff>